<commit_message>
- report for 3rd practice - fixed vulnerabilities found via OWASP ZAP DAST
</commit_message>
<xml_diff>
--- a/docs/Обеспечение безопасности при разработке программного обеспечения 2 ПИб-2310а Бакулин А.М..docx
+++ b/docs/Обеспечение безопасности при разработке программного обеспечения 2 ПИб-2310а Бакулин А.М..docx
@@ -437,27 +437,7 @@
           <w:sz w:val="32"/>
           <w:szCs w:val="32"/>
         </w:rPr>
-        <w:t xml:space="preserve">Практическое задание № </w:t>
-      </w:r>
-      <w:r>
-        <w:rPr>
-          <w:b/>
-          <w:bCs/>
-          <w:caps/>
-          <w:sz w:val="32"/>
-          <w:szCs w:val="32"/>
-        </w:rPr>
-        <w:t>2</w:t>
-      </w:r>
-      <w:r>
-        <w:rPr>
-          <w:b/>
-          <w:bCs/>
-          <w:caps/>
-          <w:sz w:val="32"/>
-          <w:szCs w:val="32"/>
-        </w:rPr>
-        <w:t xml:space="preserve"> </w:t>
+        <w:t xml:space="preserve">Практическое задание № 2 </w:t>
       </w:r>
     </w:p>
     <w:p>
@@ -1414,7 +1394,7 @@
           </w:tcPr>
           <w:p>
             <w:pPr>
-              <w:pStyle w:val="Style21"/>
+              <w:pStyle w:val="user5"/>
               <w:rPr/>
             </w:pPr>
             <w:r>
@@ -1424,7 +1404,7 @@
           </w:p>
           <w:p>
             <w:pPr>
-              <w:pStyle w:val="Style21"/>
+              <w:pStyle w:val="user5"/>
               <w:rPr/>
             </w:pPr>
             <w:r>
@@ -1438,7 +1418,7 @@
           </w:p>
           <w:p>
             <w:pPr>
-              <w:pStyle w:val="Style21"/>
+              <w:pStyle w:val="user5"/>
               <w:rPr/>
             </w:pPr>
             <w:r>
@@ -1452,7 +1432,7 @@
           </w:p>
           <w:p>
             <w:pPr>
-              <w:pStyle w:val="Style21"/>
+              <w:pStyle w:val="user5"/>
               <w:rPr/>
             </w:pPr>
             <w:r>
@@ -1466,7 +1446,7 @@
           </w:p>
           <w:p>
             <w:pPr>
-              <w:pStyle w:val="Style21"/>
+              <w:pStyle w:val="user5"/>
               <w:rPr/>
             </w:pPr>
             <w:r>
@@ -1480,7 +1460,7 @@
           </w:p>
           <w:p>
             <w:pPr>
-              <w:pStyle w:val="Style21"/>
+              <w:pStyle w:val="user5"/>
               <w:rPr/>
             </w:pPr>
             <w:r>
@@ -1494,7 +1474,7 @@
           </w:p>
           <w:p>
             <w:pPr>
-              <w:pStyle w:val="Style21"/>
+              <w:pStyle w:val="user5"/>
               <w:rPr/>
             </w:pPr>
             <w:r>
@@ -1508,7 +1488,7 @@
           </w:p>
           <w:p>
             <w:pPr>
-              <w:pStyle w:val="Style21"/>
+              <w:pStyle w:val="user5"/>
               <w:rPr/>
             </w:pPr>
             <w:r>
@@ -1522,7 +1502,7 @@
           </w:p>
           <w:p>
             <w:pPr>
-              <w:pStyle w:val="Style21"/>
+              <w:pStyle w:val="user5"/>
               <w:rPr/>
             </w:pPr>
             <w:r>
@@ -1536,7 +1516,7 @@
           </w:p>
           <w:p>
             <w:pPr>
-              <w:pStyle w:val="Style21"/>
+              <w:pStyle w:val="user5"/>
               <w:rPr/>
             </w:pPr>
             <w:r>
@@ -1550,7 +1530,7 @@
           </w:p>
           <w:p>
             <w:pPr>
-              <w:pStyle w:val="Style21"/>
+              <w:pStyle w:val="user5"/>
               <w:rPr/>
             </w:pPr>
             <w:r>
@@ -1564,7 +1544,7 @@
           </w:p>
           <w:p>
             <w:pPr>
-              <w:pStyle w:val="Style21"/>
+              <w:pStyle w:val="user5"/>
               <w:rPr/>
             </w:pPr>
             <w:r>
@@ -1578,7 +1558,7 @@
           </w:p>
           <w:p>
             <w:pPr>
-              <w:pStyle w:val="Style21"/>
+              <w:pStyle w:val="user5"/>
               <w:rPr/>
             </w:pPr>
             <w:r>
@@ -1592,7 +1572,7 @@
           </w:p>
           <w:p>
             <w:pPr>
-              <w:pStyle w:val="Style21"/>
+              <w:pStyle w:val="user5"/>
               <w:rPr/>
             </w:pPr>
             <w:r>
@@ -1606,7 +1586,7 @@
           </w:p>
           <w:p>
             <w:pPr>
-              <w:pStyle w:val="Style21"/>
+              <w:pStyle w:val="user5"/>
               <w:rPr/>
             </w:pPr>
             <w:r>
@@ -1620,7 +1600,7 @@
           </w:p>
           <w:p>
             <w:pPr>
-              <w:pStyle w:val="Style21"/>
+              <w:pStyle w:val="user5"/>
               <w:rPr/>
             </w:pPr>
             <w:r>
@@ -1634,7 +1614,7 @@
           </w:p>
           <w:p>
             <w:pPr>
-              <w:pStyle w:val="Style21"/>
+              <w:pStyle w:val="user5"/>
               <w:rPr/>
             </w:pPr>
             <w:r>
@@ -1648,7 +1628,7 @@
           </w:p>
           <w:p>
             <w:pPr>
-              <w:pStyle w:val="Style21"/>
+              <w:pStyle w:val="user5"/>
               <w:rPr/>
             </w:pPr>
             <w:r>
@@ -1662,7 +1642,7 @@
           </w:p>
           <w:p>
             <w:pPr>
-              <w:pStyle w:val="Style21"/>
+              <w:pStyle w:val="user5"/>
               <w:rPr/>
             </w:pPr>
             <w:r>
@@ -1676,7 +1656,7 @@
           </w:p>
           <w:p>
             <w:pPr>
-              <w:pStyle w:val="Style21"/>
+              <w:pStyle w:val="user5"/>
               <w:rPr/>
             </w:pPr>
             <w:r>
@@ -1690,7 +1670,7 @@
           </w:p>
           <w:p>
             <w:pPr>
-              <w:pStyle w:val="Style21"/>
+              <w:pStyle w:val="user5"/>
               <w:rPr/>
             </w:pPr>
             <w:r>
@@ -1704,7 +1684,7 @@
           </w:p>
           <w:p>
             <w:pPr>
-              <w:pStyle w:val="Style21"/>
+              <w:pStyle w:val="user5"/>
               <w:rPr/>
             </w:pPr>
             <w:r>
@@ -1718,7 +1698,7 @@
           </w:p>
           <w:p>
             <w:pPr>
-              <w:pStyle w:val="Style21"/>
+              <w:pStyle w:val="user5"/>
               <w:rPr/>
             </w:pPr>
             <w:r>
@@ -1732,7 +1712,7 @@
           </w:p>
           <w:p>
             <w:pPr>
-              <w:pStyle w:val="Style21"/>
+              <w:pStyle w:val="user5"/>
               <w:rPr/>
             </w:pPr>
             <w:r>
@@ -1746,7 +1726,7 @@
           </w:p>
           <w:p>
             <w:pPr>
-              <w:pStyle w:val="Style21"/>
+              <w:pStyle w:val="user5"/>
               <w:rPr/>
             </w:pPr>
             <w:r>
@@ -1760,7 +1740,7 @@
           </w:p>
           <w:p>
             <w:pPr>
-              <w:pStyle w:val="Style21"/>
+              <w:pStyle w:val="user5"/>
               <w:rPr/>
             </w:pPr>
             <w:r>
@@ -1774,7 +1754,7 @@
           </w:p>
           <w:p>
             <w:pPr>
-              <w:pStyle w:val="Style21"/>
+              <w:pStyle w:val="user5"/>
               <w:rPr/>
             </w:pPr>
             <w:r>
@@ -1788,7 +1768,7 @@
           </w:p>
           <w:p>
             <w:pPr>
-              <w:pStyle w:val="Style21"/>
+              <w:pStyle w:val="user5"/>
               <w:rPr/>
             </w:pPr>
             <w:r>
@@ -1802,7 +1782,7 @@
           </w:p>
           <w:p>
             <w:pPr>
-              <w:pStyle w:val="Style21"/>
+              <w:pStyle w:val="user5"/>
               <w:rPr/>
             </w:pPr>
             <w:r>
@@ -1816,7 +1796,7 @@
           </w:p>
           <w:p>
             <w:pPr>
-              <w:pStyle w:val="Style21"/>
+              <w:pStyle w:val="user5"/>
               <w:rPr/>
             </w:pPr>
             <w:r>
@@ -1830,7 +1810,7 @@
           </w:p>
           <w:p>
             <w:pPr>
-              <w:pStyle w:val="Style21"/>
+              <w:pStyle w:val="user5"/>
               <w:rPr/>
             </w:pPr>
             <w:r>
@@ -1844,7 +1824,7 @@
           </w:p>
           <w:p>
             <w:pPr>
-              <w:pStyle w:val="Style21"/>
+              <w:pStyle w:val="user5"/>
               <w:rPr/>
             </w:pPr>
             <w:r>
@@ -1858,7 +1838,7 @@
           </w:p>
           <w:p>
             <w:pPr>
-              <w:pStyle w:val="Style21"/>
+              <w:pStyle w:val="user5"/>
               <w:rPr/>
             </w:pPr>
             <w:r>
@@ -1872,7 +1852,7 @@
           </w:p>
           <w:p>
             <w:pPr>
-              <w:pStyle w:val="Style21"/>
+              <w:pStyle w:val="user5"/>
               <w:rPr/>
             </w:pPr>
             <w:r>
@@ -1886,7 +1866,7 @@
           </w:p>
           <w:p>
             <w:pPr>
-              <w:pStyle w:val="Style21"/>
+              <w:pStyle w:val="user5"/>
               <w:rPr/>
             </w:pPr>
             <w:r>
@@ -1900,7 +1880,7 @@
           </w:p>
           <w:p>
             <w:pPr>
-              <w:pStyle w:val="Style21"/>
+              <w:pStyle w:val="user5"/>
               <w:rPr/>
             </w:pPr>
             <w:r>
@@ -1914,7 +1894,7 @@
           </w:p>
           <w:p>
             <w:pPr>
-              <w:pStyle w:val="Style21"/>
+              <w:pStyle w:val="user5"/>
               <w:rPr/>
             </w:pPr>
             <w:r>
@@ -1928,7 +1908,7 @@
           </w:p>
           <w:p>
             <w:pPr>
-              <w:pStyle w:val="Style21"/>
+              <w:pStyle w:val="user5"/>
               <w:rPr/>
             </w:pPr>
             <w:r>
@@ -1942,7 +1922,7 @@
           </w:p>
           <w:p>
             <w:pPr>
-              <w:pStyle w:val="Style21"/>
+              <w:pStyle w:val="user5"/>
               <w:rPr/>
             </w:pPr>
             <w:r>
@@ -1956,7 +1936,7 @@
           </w:p>
           <w:p>
             <w:pPr>
-              <w:pStyle w:val="Style21"/>
+              <w:pStyle w:val="user5"/>
               <w:rPr/>
             </w:pPr>
             <w:r>
@@ -1970,7 +1950,7 @@
           </w:p>
           <w:p>
             <w:pPr>
-              <w:pStyle w:val="Style21"/>
+              <w:pStyle w:val="user5"/>
               <w:rPr/>
             </w:pPr>
             <w:r>
@@ -1984,7 +1964,7 @@
           </w:p>
           <w:p>
             <w:pPr>
-              <w:pStyle w:val="Style21"/>
+              <w:pStyle w:val="user5"/>
               <w:rPr/>
             </w:pPr>
             <w:r>
@@ -1998,7 +1978,7 @@
           </w:p>
           <w:p>
             <w:pPr>
-              <w:pStyle w:val="Style21"/>
+              <w:pStyle w:val="user5"/>
               <w:rPr/>
             </w:pPr>
             <w:r>
@@ -2012,7 +1992,7 @@
           </w:p>
           <w:p>
             <w:pPr>
-              <w:pStyle w:val="Style21"/>
+              <w:pStyle w:val="user5"/>
               <w:rPr/>
             </w:pPr>
             <w:r>
@@ -2026,7 +2006,7 @@
           </w:p>
           <w:p>
             <w:pPr>
-              <w:pStyle w:val="Style21"/>
+              <w:pStyle w:val="user5"/>
               <w:rPr/>
             </w:pPr>
             <w:r>
@@ -2040,7 +2020,7 @@
           </w:p>
           <w:p>
             <w:pPr>
-              <w:pStyle w:val="Style21"/>
+              <w:pStyle w:val="user5"/>
               <w:rPr/>
             </w:pPr>
             <w:r>
@@ -2054,7 +2034,7 @@
           </w:p>
           <w:p>
             <w:pPr>
-              <w:pStyle w:val="Style21"/>
+              <w:pStyle w:val="user5"/>
               <w:rPr/>
             </w:pPr>
             <w:r>
@@ -2068,7 +2048,7 @@
           </w:p>
           <w:p>
             <w:pPr>
-              <w:pStyle w:val="Style21"/>
+              <w:pStyle w:val="user5"/>
               <w:rPr/>
             </w:pPr>
             <w:r>
@@ -2082,7 +2062,7 @@
           </w:p>
           <w:p>
             <w:pPr>
-              <w:pStyle w:val="Style21"/>
+              <w:pStyle w:val="user5"/>
               <w:rPr/>
             </w:pPr>
             <w:r>
@@ -2096,7 +2076,7 @@
           </w:p>
           <w:p>
             <w:pPr>
-              <w:pStyle w:val="Style21"/>
+              <w:pStyle w:val="user5"/>
               <w:rPr/>
             </w:pPr>
             <w:r>
@@ -2110,7 +2090,7 @@
           </w:p>
           <w:p>
             <w:pPr>
-              <w:pStyle w:val="Style21"/>
+              <w:pStyle w:val="user5"/>
               <w:rPr/>
             </w:pPr>
             <w:r>
@@ -2124,7 +2104,7 @@
           </w:p>
           <w:p>
             <w:pPr>
-              <w:pStyle w:val="Style21"/>
+              <w:pStyle w:val="user5"/>
               <w:rPr/>
             </w:pPr>
             <w:r>
@@ -2138,7 +2118,7 @@
           </w:p>
           <w:p>
             <w:pPr>
-              <w:pStyle w:val="Style21"/>
+              <w:pStyle w:val="user5"/>
               <w:rPr/>
             </w:pPr>
             <w:r>
@@ -2152,7 +2132,7 @@
           </w:p>
           <w:p>
             <w:pPr>
-              <w:pStyle w:val="Style21"/>
+              <w:pStyle w:val="user5"/>
               <w:rPr/>
             </w:pPr>
             <w:r>
@@ -2166,7 +2146,7 @@
           </w:p>
           <w:p>
             <w:pPr>
-              <w:pStyle w:val="Style21"/>
+              <w:pStyle w:val="user5"/>
               <w:rPr/>
             </w:pPr>
             <w:r>
@@ -2180,7 +2160,7 @@
           </w:p>
           <w:p>
             <w:pPr>
-              <w:pStyle w:val="Style21"/>
+              <w:pStyle w:val="user5"/>
               <w:rPr/>
             </w:pPr>
             <w:r>
@@ -2194,7 +2174,7 @@
           </w:p>
           <w:p>
             <w:pPr>
-              <w:pStyle w:val="Style21"/>
+              <w:pStyle w:val="user5"/>
               <w:rPr/>
             </w:pPr>
             <w:r>
@@ -2208,7 +2188,7 @@
           </w:p>
           <w:p>
             <w:pPr>
-              <w:pStyle w:val="Style21"/>
+              <w:pStyle w:val="user5"/>
               <w:rPr/>
             </w:pPr>
             <w:r>
@@ -2222,7 +2202,7 @@
           </w:p>
           <w:p>
             <w:pPr>
-              <w:pStyle w:val="Style21"/>
+              <w:pStyle w:val="user5"/>
               <w:rPr/>
             </w:pPr>
             <w:r>
@@ -2236,7 +2216,7 @@
           </w:p>
           <w:p>
             <w:pPr>
-              <w:pStyle w:val="Style21"/>
+              <w:pStyle w:val="user5"/>
               <w:rPr/>
             </w:pPr>
             <w:r>
@@ -2250,7 +2230,7 @@
           </w:p>
           <w:p>
             <w:pPr>
-              <w:pStyle w:val="Style21"/>
+              <w:pStyle w:val="user5"/>
               <w:rPr/>
             </w:pPr>
             <w:r>
@@ -2264,7 +2244,7 @@
           </w:p>
           <w:p>
             <w:pPr>
-              <w:pStyle w:val="Style21"/>
+              <w:pStyle w:val="user5"/>
               <w:rPr/>
             </w:pPr>
             <w:r>
@@ -2278,7 +2258,7 @@
           </w:p>
           <w:p>
             <w:pPr>
-              <w:pStyle w:val="Style21"/>
+              <w:pStyle w:val="user5"/>
               <w:rPr/>
             </w:pPr>
             <w:r>
@@ -2292,7 +2272,7 @@
           </w:p>
           <w:p>
             <w:pPr>
-              <w:pStyle w:val="Style21"/>
+              <w:pStyle w:val="user5"/>
               <w:rPr/>
             </w:pPr>
             <w:r>
@@ -2306,7 +2286,7 @@
           </w:p>
           <w:p>
             <w:pPr>
-              <w:pStyle w:val="Style21"/>
+              <w:pStyle w:val="user5"/>
               <w:rPr/>
             </w:pPr>
             <w:r>
@@ -2320,7 +2300,7 @@
           </w:p>
           <w:p>
             <w:pPr>
-              <w:pStyle w:val="Style21"/>
+              <w:pStyle w:val="user5"/>
               <w:rPr/>
             </w:pPr>
             <w:r>
@@ -2334,7 +2314,7 @@
           </w:p>
           <w:p>
             <w:pPr>
-              <w:pStyle w:val="Style21"/>
+              <w:pStyle w:val="user5"/>
               <w:rPr/>
             </w:pPr>
             <w:r>
@@ -2348,7 +2328,7 @@
           </w:p>
           <w:p>
             <w:pPr>
-              <w:pStyle w:val="Style21"/>
+              <w:pStyle w:val="user5"/>
               <w:rPr/>
             </w:pPr>
             <w:r>
@@ -2362,7 +2342,7 @@
           </w:p>
           <w:p>
             <w:pPr>
-              <w:pStyle w:val="Style21"/>
+              <w:pStyle w:val="user5"/>
               <w:rPr/>
             </w:pPr>
             <w:r>
@@ -2376,7 +2356,7 @@
           </w:p>
           <w:p>
             <w:pPr>
-              <w:pStyle w:val="Style21"/>
+              <w:pStyle w:val="user5"/>
               <w:rPr/>
             </w:pPr>
             <w:r>
@@ -2390,7 +2370,7 @@
           </w:p>
           <w:p>
             <w:pPr>
-              <w:pStyle w:val="Style21"/>
+              <w:pStyle w:val="user5"/>
               <w:rPr/>
             </w:pPr>
             <w:r>
@@ -2404,7 +2384,7 @@
           </w:p>
           <w:p>
             <w:pPr>
-              <w:pStyle w:val="Style21"/>
+              <w:pStyle w:val="user5"/>
               <w:rPr/>
             </w:pPr>
             <w:r>
@@ -2418,7 +2398,7 @@
           </w:p>
           <w:p>
             <w:pPr>
-              <w:pStyle w:val="Style21"/>
+              <w:pStyle w:val="user5"/>
               <w:rPr/>
             </w:pPr>
             <w:r>
@@ -2432,7 +2412,7 @@
           </w:p>
           <w:p>
             <w:pPr>
-              <w:pStyle w:val="Style21"/>
+              <w:pStyle w:val="user5"/>
               <w:rPr/>
             </w:pPr>
             <w:r>
@@ -2446,7 +2426,7 @@
           </w:p>
           <w:p>
             <w:pPr>
-              <w:pStyle w:val="Style21"/>
+              <w:pStyle w:val="user5"/>
               <w:rPr/>
             </w:pPr>
             <w:r>
@@ -2460,7 +2440,7 @@
           </w:p>
           <w:p>
             <w:pPr>
-              <w:pStyle w:val="Style21"/>
+              <w:pStyle w:val="user5"/>
               <w:rPr/>
             </w:pPr>
             <w:r>
@@ -2474,7 +2454,7 @@
           </w:p>
           <w:p>
             <w:pPr>
-              <w:pStyle w:val="Style21"/>
+              <w:pStyle w:val="user5"/>
               <w:rPr/>
             </w:pPr>
             <w:r>
@@ -2488,7 +2468,7 @@
           </w:p>
           <w:p>
             <w:pPr>
-              <w:pStyle w:val="Style21"/>
+              <w:pStyle w:val="user5"/>
               <w:rPr/>
             </w:pPr>
             <w:r>
@@ -2502,7 +2482,7 @@
           </w:p>
           <w:p>
             <w:pPr>
-              <w:pStyle w:val="Style21"/>
+              <w:pStyle w:val="user5"/>
               <w:rPr/>
             </w:pPr>
             <w:r>
@@ -2516,7 +2496,7 @@
           </w:p>
           <w:p>
             <w:pPr>
-              <w:pStyle w:val="Style21"/>
+              <w:pStyle w:val="user5"/>
               <w:rPr/>
             </w:pPr>
             <w:r>
@@ -2530,7 +2510,7 @@
           </w:p>
           <w:p>
             <w:pPr>
-              <w:pStyle w:val="Style21"/>
+              <w:pStyle w:val="user5"/>
               <w:rPr/>
             </w:pPr>
             <w:r>
@@ -2544,7 +2524,7 @@
           </w:p>
           <w:p>
             <w:pPr>
-              <w:pStyle w:val="Style21"/>
+              <w:pStyle w:val="user5"/>
               <w:rPr/>
             </w:pPr>
             <w:r>
@@ -2558,7 +2538,7 @@
           </w:p>
           <w:p>
             <w:pPr>
-              <w:pStyle w:val="Style21"/>
+              <w:pStyle w:val="user5"/>
               <w:rPr/>
             </w:pPr>
             <w:r>
@@ -2572,7 +2552,7 @@
           </w:p>
           <w:p>
             <w:pPr>
-              <w:pStyle w:val="Style21"/>
+              <w:pStyle w:val="user5"/>
               <w:rPr/>
             </w:pPr>
             <w:r>
@@ -2586,7 +2566,7 @@
           </w:p>
           <w:p>
             <w:pPr>
-              <w:pStyle w:val="Style21"/>
+              <w:pStyle w:val="user5"/>
               <w:rPr/>
             </w:pPr>
             <w:r>
@@ -2600,7 +2580,7 @@
           </w:p>
           <w:p>
             <w:pPr>
-              <w:pStyle w:val="Style21"/>
+              <w:pStyle w:val="user5"/>
               <w:rPr/>
             </w:pPr>
             <w:r>
@@ -2614,7 +2594,7 @@
           </w:p>
           <w:p>
             <w:pPr>
-              <w:pStyle w:val="Style21"/>
+              <w:pStyle w:val="user5"/>
               <w:rPr/>
             </w:pPr>
             <w:r>
@@ -2628,7 +2608,7 @@
           </w:p>
           <w:p>
             <w:pPr>
-              <w:pStyle w:val="Style21"/>
+              <w:pStyle w:val="user5"/>
               <w:rPr/>
             </w:pPr>
             <w:r>
@@ -2642,7 +2622,7 @@
           </w:p>
           <w:p>
             <w:pPr>
-              <w:pStyle w:val="Style21"/>
+              <w:pStyle w:val="user5"/>
               <w:rPr/>
             </w:pPr>
             <w:r>
@@ -2656,7 +2636,7 @@
           </w:p>
           <w:p>
             <w:pPr>
-              <w:pStyle w:val="Style21"/>
+              <w:pStyle w:val="user5"/>
               <w:rPr/>
             </w:pPr>
             <w:r>
@@ -2670,7 +2650,7 @@
           </w:p>
           <w:p>
             <w:pPr>
-              <w:pStyle w:val="Style21"/>
+              <w:pStyle w:val="user5"/>
               <w:rPr/>
             </w:pPr>
             <w:r>
@@ -2684,7 +2664,7 @@
           </w:p>
           <w:p>
             <w:pPr>
-              <w:pStyle w:val="Style21"/>
+              <w:pStyle w:val="user5"/>
               <w:rPr/>
             </w:pPr>
             <w:r>
@@ -2698,7 +2678,7 @@
           </w:p>
           <w:p>
             <w:pPr>
-              <w:pStyle w:val="Style21"/>
+              <w:pStyle w:val="user5"/>
               <w:rPr/>
             </w:pPr>
             <w:r>
@@ -2712,7 +2692,7 @@
           </w:p>
           <w:p>
             <w:pPr>
-              <w:pStyle w:val="Style21"/>
+              <w:pStyle w:val="user5"/>
               <w:rPr/>
             </w:pPr>
             <w:r>
@@ -2726,7 +2706,7 @@
           </w:p>
           <w:p>
             <w:pPr>
-              <w:pStyle w:val="Style21"/>
+              <w:pStyle w:val="user5"/>
               <w:rPr/>
             </w:pPr>
             <w:r>
@@ -2740,7 +2720,7 @@
           </w:p>
           <w:p>
             <w:pPr>
-              <w:pStyle w:val="Style21"/>
+              <w:pStyle w:val="user5"/>
               <w:rPr/>
             </w:pPr>
             <w:r>
@@ -2754,7 +2734,7 @@
           </w:p>
           <w:p>
             <w:pPr>
-              <w:pStyle w:val="Style21"/>
+              <w:pStyle w:val="user5"/>
               <w:rPr/>
             </w:pPr>
             <w:r>
@@ -2768,7 +2748,7 @@
           </w:p>
           <w:p>
             <w:pPr>
-              <w:pStyle w:val="Style21"/>
+              <w:pStyle w:val="user5"/>
               <w:rPr/>
             </w:pPr>
             <w:r>
@@ -2782,7 +2762,7 @@
           </w:p>
           <w:p>
             <w:pPr>
-              <w:pStyle w:val="Style21"/>
+              <w:pStyle w:val="user5"/>
               <w:rPr/>
             </w:pPr>
             <w:r>
@@ -2796,7 +2776,7 @@
           </w:p>
           <w:p>
             <w:pPr>
-              <w:pStyle w:val="Style21"/>
+              <w:pStyle w:val="user5"/>
               <w:rPr/>
             </w:pPr>
             <w:r>
@@ -2810,7 +2790,7 @@
           </w:p>
           <w:p>
             <w:pPr>
-              <w:pStyle w:val="Style21"/>
+              <w:pStyle w:val="user5"/>
               <w:rPr/>
             </w:pPr>
             <w:r>
@@ -2824,7 +2804,7 @@
           </w:p>
           <w:p>
             <w:pPr>
-              <w:pStyle w:val="Style21"/>
+              <w:pStyle w:val="user5"/>
               <w:rPr/>
             </w:pPr>
             <w:r>
@@ -2838,7 +2818,7 @@
           </w:p>
           <w:p>
             <w:pPr>
-              <w:pStyle w:val="Style21"/>
+              <w:pStyle w:val="user5"/>
               <w:rPr/>
             </w:pPr>
             <w:r>
@@ -2852,7 +2832,7 @@
           </w:p>
           <w:p>
             <w:pPr>
-              <w:pStyle w:val="Style21"/>
+              <w:pStyle w:val="user5"/>
               <w:rPr/>
             </w:pPr>
             <w:r>
@@ -2866,7 +2846,7 @@
           </w:p>
           <w:p>
             <w:pPr>
-              <w:pStyle w:val="Style21"/>
+              <w:pStyle w:val="user5"/>
               <w:rPr/>
             </w:pPr>
             <w:r>
@@ -2880,7 +2860,7 @@
           </w:p>
           <w:p>
             <w:pPr>
-              <w:pStyle w:val="Style21"/>
+              <w:pStyle w:val="user5"/>
               <w:rPr/>
             </w:pPr>
             <w:r>
@@ -2894,7 +2874,7 @@
           </w:p>
           <w:p>
             <w:pPr>
-              <w:pStyle w:val="Style21"/>
+              <w:pStyle w:val="user5"/>
               <w:rPr/>
             </w:pPr>
             <w:r>
@@ -2908,7 +2888,7 @@
           </w:p>
           <w:p>
             <w:pPr>
-              <w:pStyle w:val="Style21"/>
+              <w:pStyle w:val="user5"/>
               <w:rPr/>
             </w:pPr>
             <w:r>
@@ -2922,7 +2902,7 @@
           </w:p>
           <w:p>
             <w:pPr>
-              <w:pStyle w:val="Style21"/>
+              <w:pStyle w:val="user5"/>
               <w:rPr/>
             </w:pPr>
             <w:r>
@@ -2936,7 +2916,7 @@
           </w:p>
           <w:p>
             <w:pPr>
-              <w:pStyle w:val="Style21"/>
+              <w:pStyle w:val="user5"/>
               <w:rPr/>
             </w:pPr>
             <w:r>
@@ -2950,7 +2930,7 @@
           </w:p>
           <w:p>
             <w:pPr>
-              <w:pStyle w:val="Style21"/>
+              <w:pStyle w:val="user5"/>
               <w:rPr/>
             </w:pPr>
             <w:r>
@@ -2964,7 +2944,7 @@
           </w:p>
           <w:p>
             <w:pPr>
-              <w:pStyle w:val="Style21"/>
+              <w:pStyle w:val="user5"/>
               <w:rPr/>
             </w:pPr>
             <w:r>
@@ -2978,7 +2958,7 @@
           </w:p>
           <w:p>
             <w:pPr>
-              <w:pStyle w:val="Style21"/>
+              <w:pStyle w:val="user5"/>
               <w:rPr/>
             </w:pPr>
             <w:r>
@@ -2992,7 +2972,7 @@
           </w:p>
           <w:p>
             <w:pPr>
-              <w:pStyle w:val="Style21"/>
+              <w:pStyle w:val="user5"/>
               <w:rPr/>
             </w:pPr>
             <w:r>
@@ -3006,7 +2986,7 @@
           </w:p>
           <w:p>
             <w:pPr>
-              <w:pStyle w:val="Style21"/>
+              <w:pStyle w:val="user5"/>
               <w:rPr/>
             </w:pPr>
             <w:r>
@@ -3020,7 +3000,7 @@
           </w:p>
           <w:p>
             <w:pPr>
-              <w:pStyle w:val="Style21"/>
+              <w:pStyle w:val="user5"/>
               <w:rPr/>
             </w:pPr>
             <w:r>
@@ -3034,7 +3014,7 @@
           </w:p>
           <w:p>
             <w:pPr>
-              <w:pStyle w:val="Style21"/>
+              <w:pStyle w:val="user5"/>
               <w:rPr/>
             </w:pPr>
             <w:r>
@@ -3048,7 +3028,7 @@
           </w:p>
           <w:p>
             <w:pPr>
-              <w:pStyle w:val="Style21"/>
+              <w:pStyle w:val="user5"/>
               <w:rPr/>
             </w:pPr>
             <w:r>
@@ -3062,7 +3042,7 @@
           </w:p>
           <w:p>
             <w:pPr>
-              <w:pStyle w:val="Style21"/>
+              <w:pStyle w:val="user5"/>
               <w:rPr/>
             </w:pPr>
             <w:r>
@@ -3076,7 +3056,7 @@
           </w:p>
           <w:p>
             <w:pPr>
-              <w:pStyle w:val="Style21"/>
+              <w:pStyle w:val="user5"/>
               <w:rPr/>
             </w:pPr>
             <w:r>
@@ -3090,7 +3070,7 @@
           </w:p>
           <w:p>
             <w:pPr>
-              <w:pStyle w:val="Style21"/>
+              <w:pStyle w:val="user5"/>
               <w:rPr/>
             </w:pPr>
             <w:r>
@@ -3104,7 +3084,7 @@
           </w:p>
           <w:p>
             <w:pPr>
-              <w:pStyle w:val="Style21"/>
+              <w:pStyle w:val="user5"/>
               <w:rPr/>
             </w:pPr>
             <w:r>
@@ -3118,7 +3098,7 @@
           </w:p>
           <w:p>
             <w:pPr>
-              <w:pStyle w:val="Style21"/>
+              <w:pStyle w:val="user5"/>
               <w:rPr/>
             </w:pPr>
             <w:r>
@@ -3132,7 +3112,7 @@
           </w:p>
           <w:p>
             <w:pPr>
-              <w:pStyle w:val="Style21"/>
+              <w:pStyle w:val="user5"/>
               <w:rPr/>
             </w:pPr>
             <w:r>
@@ -3146,7 +3126,7 @@
           </w:p>
           <w:p>
             <w:pPr>
-              <w:pStyle w:val="Style21"/>
+              <w:pStyle w:val="user5"/>
               <w:rPr/>
             </w:pPr>
             <w:r>
@@ -3160,7 +3140,7 @@
           </w:p>
           <w:p>
             <w:pPr>
-              <w:pStyle w:val="Style21"/>
+              <w:pStyle w:val="user5"/>
               <w:rPr/>
             </w:pPr>
             <w:r>
@@ -3241,7 +3221,15 @@
           <w:szCs w:val="28"/>
           <w:lang w:val="ru-RU"/>
         </w:rPr>
-        <w:t xml:space="preserve">соответственно. </w:t>
+        <w:t xml:space="preserve">соответственно. Найденная уязвимость уровня </w:t>
+      </w:r>
+      <w:r>
+        <w:rPr>
+          <w:sz w:val="28"/>
+          <w:szCs w:val="28"/>
+          <w:lang w:val="en-US"/>
+        </w:rPr>
+        <w:t>HIGH</w:t>
       </w:r>
       <w:r>
         <w:rPr>
@@ -3249,7 +3237,15 @@
           <w:szCs w:val="28"/>
           <w:lang w:val="ru-RU"/>
         </w:rPr>
-        <w:t>Найденная у</w:t>
+        <w:t xml:space="preserve"> (</w:t>
+      </w:r>
+      <w:r>
+        <w:rPr>
+          <w:sz w:val="28"/>
+          <w:szCs w:val="28"/>
+          <w:lang w:val="en-US"/>
+        </w:rPr>
+        <w:t>CWE-94</w:t>
       </w:r>
       <w:r>
         <w:rPr>
@@ -3257,55 +3253,7 @@
           <w:szCs w:val="28"/>
           <w:lang w:val="ru-RU"/>
         </w:rPr>
-        <w:t xml:space="preserve">язвимость уровня </w:t>
-      </w:r>
-      <w:r>
-        <w:rPr>
-          <w:sz w:val="28"/>
-          <w:szCs w:val="28"/>
-          <w:lang w:val="en-US"/>
-        </w:rPr>
-        <w:t>HIGH</w:t>
-      </w:r>
-      <w:r>
-        <w:rPr>
-          <w:sz w:val="28"/>
-          <w:szCs w:val="28"/>
-          <w:lang w:val="ru-RU"/>
-        </w:rPr>
-        <w:t xml:space="preserve"> </w:t>
-      </w:r>
-      <w:r>
-        <w:rPr>
-          <w:sz w:val="28"/>
-          <w:szCs w:val="28"/>
-          <w:lang w:val="ru-RU"/>
-        </w:rPr>
-        <w:t>(</w:t>
-      </w:r>
-      <w:r>
-        <w:rPr>
-          <w:sz w:val="28"/>
-          <w:szCs w:val="28"/>
-          <w:lang w:val="en-US"/>
-        </w:rPr>
-        <w:t>CWE-94</w:t>
-      </w:r>
-      <w:r>
-        <w:rPr>
-          <w:sz w:val="28"/>
-          <w:szCs w:val="28"/>
-          <w:lang w:val="ru-RU"/>
-        </w:rPr>
-        <w:t>)</w:t>
-      </w:r>
-      <w:r>
-        <w:rPr>
-          <w:sz w:val="28"/>
-          <w:szCs w:val="28"/>
-          <w:lang w:val="ru-RU"/>
-        </w:rPr>
-        <w:t xml:space="preserve"> заключается в возможности исполнения произвольного кода в консоли отладки </w:t>
+        <w:t xml:space="preserve">) заключается в возможности исполнения произвольного кода в консоли отладки </w:t>
       </w:r>
       <w:r>
         <w:rPr>
@@ -3486,7 +3434,15 @@
           <w:szCs w:val="28"/>
           <w:lang w:val="en-US"/>
         </w:rPr>
-        <w:t>(</w:t>
+        <w:t>(т</w:t>
+      </w:r>
+      <w:r>
+        <w:rPr>
+          <w:sz w:val="28"/>
+          <w:szCs w:val="28"/>
+          <w:lang w:val="ru-RU"/>
+        </w:rPr>
+        <w:t xml:space="preserve">аблица </w:t>
       </w:r>
       <w:r>
         <w:rPr>
@@ -3494,23 +3450,7 @@
           <w:szCs w:val="28"/>
           <w:lang w:val="en-US"/>
         </w:rPr>
-        <w:t>т</w:t>
-      </w:r>
-      <w:r>
-        <w:rPr>
-          <w:sz w:val="28"/>
-          <w:szCs w:val="28"/>
-          <w:lang w:val="ru-RU"/>
-        </w:rPr>
-        <w:t>аблица</w:t>
-      </w:r>
-      <w:r>
-        <w:rPr>
-          <w:sz w:val="28"/>
-          <w:szCs w:val="28"/>
-          <w:lang w:val="ru-RU"/>
-        </w:rPr>
-        <w:t xml:space="preserve"> </w:t>
+        <w:t xml:space="preserve">3 - </w:t>
       </w:r>
       <w:r>
         <w:rPr>
@@ -3518,7 +3458,7 @@
           <w:szCs w:val="28"/>
           <w:lang w:val="en-US"/>
         </w:rPr>
-        <w:t>3</w:t>
+        <w:t>4</w:t>
       </w:r>
       <w:r>
         <w:rPr>
@@ -3624,7 +3564,7 @@
           </w:tcPr>
           <w:p>
             <w:pPr>
-              <w:pStyle w:val="Style21"/>
+              <w:pStyle w:val="user5"/>
               <w:rPr/>
             </w:pPr>
             <w:r>
@@ -3634,7 +3574,7 @@
           </w:p>
           <w:p>
             <w:pPr>
-              <w:pStyle w:val="Style21"/>
+              <w:pStyle w:val="user5"/>
               <w:rPr/>
             </w:pPr>
             <w:r>
@@ -3644,7 +3584,7 @@
           </w:p>
           <w:p>
             <w:pPr>
-              <w:pStyle w:val="Style21"/>
+              <w:pStyle w:val="user5"/>
               <w:rPr/>
             </w:pPr>
             <w:r>
@@ -3701,7 +3641,15 @@
           <w:szCs w:val="28"/>
           <w:lang w:val="en-US"/>
         </w:rPr>
-        <w:t>app.py</w:t>
+        <w:t>config</w:t>
+      </w:r>
+      <w:r>
+        <w:rPr>
+          <w:sz w:val="28"/>
+          <w:szCs w:val="28"/>
+          <w:lang w:val="en-US"/>
+        </w:rPr>
+        <w:t>.py</w:t>
       </w:r>
     </w:p>
     <w:tbl>
@@ -3734,7 +3682,7 @@
           </w:tcPr>
           <w:p>
             <w:pPr>
-              <w:pStyle w:val="Style21"/>
+              <w:pStyle w:val="user5"/>
               <w:rPr/>
             </w:pPr>
             <w:r>
@@ -3772,7 +3720,7 @@
           </w:p>
           <w:p>
             <w:pPr>
-              <w:pStyle w:val="Style21"/>
+              <w:pStyle w:val="user5"/>
               <w:rPr>
                 <w:lang w:val="ru-RU"/>
               </w:rPr>
@@ -3781,26 +3729,12 @@
               <w:rPr>
                 <w:lang w:val="ru-RU"/>
               </w:rPr>
-              <w:t>from pathlib import Path</w:t>
-            </w:r>
-          </w:p>
-          <w:p>
-            <w:pPr>
-              <w:pStyle w:val="Style21"/>
-              <w:rPr>
-                <w:lang w:val="ru-RU"/>
-              </w:rPr>
-            </w:pPr>
-            <w:r>
-              <w:rPr>
-                <w:lang w:val="ru-RU"/>
-              </w:rPr>
               <w:t>from dataclasses import dataclass, asdict</w:t>
             </w:r>
           </w:p>
           <w:p>
             <w:pPr>
-              <w:pStyle w:val="Style21"/>
+              <w:pStyle w:val="user5"/>
               <w:rPr>
                 <w:lang w:val="ru-RU"/>
               </w:rPr>
@@ -3820,7 +3754,7 @@
           </w:p>
           <w:p>
             <w:pPr>
-              <w:pStyle w:val="Style21"/>
+              <w:pStyle w:val="user5"/>
               <w:rPr>
                 <w:lang w:val="ru-RU"/>
               </w:rPr>
@@ -3834,7 +3768,7 @@
           </w:p>
           <w:p>
             <w:pPr>
-              <w:pStyle w:val="Style21"/>
+              <w:pStyle w:val="user5"/>
               <w:rPr>
                 <w:lang w:val="ru-RU"/>
               </w:rPr>
@@ -3854,7 +3788,7 @@
           </w:p>
           <w:p>
             <w:pPr>
-              <w:pStyle w:val="Style21"/>
+              <w:pStyle w:val="user5"/>
               <w:rPr>
                 <w:lang w:val="ru-RU"/>
               </w:rPr>
@@ -3874,7 +3808,7 @@
           </w:p>
           <w:p>
             <w:pPr>
-              <w:pStyle w:val="Style21"/>
+              <w:pStyle w:val="user5"/>
               <w:rPr>
                 <w:lang w:val="ru-RU"/>
               </w:rPr>
@@ -3894,7 +3828,7 @@
           </w:p>
           <w:p>
             <w:pPr>
-              <w:pStyle w:val="Style21"/>
+              <w:pStyle w:val="user5"/>
               <w:rPr>
                 <w:lang w:val="ru-RU"/>
               </w:rPr>
@@ -3907,7 +3841,7 @@
           </w:p>
           <w:p>
             <w:pPr>
-              <w:pStyle w:val="Style21"/>
+              <w:pStyle w:val="user5"/>
               <w:rPr>
                 <w:lang w:val="ru-RU"/>
               </w:rPr>
@@ -3927,7 +3861,7 @@
           </w:p>
           <w:p>
             <w:pPr>
-              <w:pStyle w:val="Style21"/>
+              <w:pStyle w:val="user5"/>
               <w:rPr>
                 <w:lang w:val="ru-RU"/>
               </w:rPr>
@@ -3947,7 +3881,7 @@
           </w:p>
           <w:p>
             <w:pPr>
-              <w:pStyle w:val="Style21"/>
+              <w:pStyle w:val="user5"/>
               <w:rPr>
                 <w:lang w:val="ru-RU"/>
               </w:rPr>
@@ -3967,7 +3901,7 @@
           </w:p>
           <w:p>
             <w:pPr>
-              <w:pStyle w:val="Style21"/>
+              <w:pStyle w:val="user5"/>
               <w:rPr>
                 <w:lang w:val="ru-RU"/>
               </w:rPr>
@@ -3987,7 +3921,7 @@
           </w:p>
           <w:p>
             <w:pPr>
-              <w:pStyle w:val="Style21"/>
+              <w:pStyle w:val="user5"/>
               <w:rPr>
                 <w:lang w:val="ru-RU"/>
               </w:rPr>
@@ -4007,7 +3941,7 @@
           </w:p>
           <w:p>
             <w:pPr>
-              <w:pStyle w:val="Style21"/>
+              <w:pStyle w:val="user5"/>
               <w:rPr>
                 <w:lang w:val="ru-RU"/>
               </w:rPr>
@@ -4027,7 +3961,7 @@
           </w:p>
           <w:p>
             <w:pPr>
-              <w:pStyle w:val="Style21"/>
+              <w:pStyle w:val="user5"/>
               <w:rPr>
                 <w:lang w:val="ru-RU"/>
               </w:rPr>
@@ -4047,7 +3981,7 @@
           </w:p>
           <w:p>
             <w:pPr>
-              <w:pStyle w:val="Style21"/>
+              <w:pStyle w:val="user5"/>
               <w:rPr>
                 <w:lang w:val="ru-RU"/>
               </w:rPr>
@@ -4067,7 +4001,7 @@
           </w:p>
           <w:p>
             <w:pPr>
-              <w:pStyle w:val="Style21"/>
+              <w:pStyle w:val="user5"/>
               <w:rPr>
                 <w:lang w:val="ru-RU"/>
               </w:rPr>
@@ -4080,7 +4014,7 @@
           </w:p>
           <w:p>
             <w:pPr>
-              <w:pStyle w:val="Style21"/>
+              <w:pStyle w:val="user5"/>
               <w:rPr>
                 <w:lang w:val="ru-RU"/>
               </w:rPr>
@@ -4096,86 +4030,6 @@
                 <w:lang w:val="ru-RU"/>
               </w:rPr>
               <w:t>return asdict(self)</w:t>
-            </w:r>
-          </w:p>
-          <w:p>
-            <w:pPr>
-              <w:pStyle w:val="Style21"/>
-              <w:rPr>
-                <w:lang w:val="ru-RU"/>
-              </w:rPr>
-            </w:pPr>
-            <w:r>
-              <w:rPr>
-                <w:lang w:val="ru-RU"/>
-              </w:rPr>
-            </w:r>
-          </w:p>
-          <w:p>
-            <w:pPr>
-              <w:pStyle w:val="Style21"/>
-              <w:rPr>
-                <w:lang w:val="ru-RU"/>
-              </w:rPr>
-            </w:pPr>
-            <w:r>
-              <w:rPr>
-                <w:lang w:val="ru-RU"/>
-              </w:rPr>
-            </w:r>
-          </w:p>
-          <w:p>
-            <w:pPr>
-              <w:pStyle w:val="Style21"/>
-              <w:rPr>
-                <w:lang w:val="ru-RU"/>
-              </w:rPr>
-            </w:pPr>
-            <w:r>
-              <w:rPr>
-                <w:lang w:val="ru-RU"/>
-              </w:rPr>
-              <w:t>if __name__ == '__main__':</w:t>
-            </w:r>
-          </w:p>
-          <w:p>
-            <w:pPr>
-              <w:pStyle w:val="Style21"/>
-              <w:rPr>
-                <w:lang w:val="ru-RU"/>
-              </w:rPr>
-            </w:pPr>
-            <w:r>
-              <w:rPr>
-                <w:lang w:val="ru-RU"/>
-              </w:rPr>
-              <w:t xml:space="preserve">    </w:t>
-            </w:r>
-            <w:r>
-              <w:rPr>
-                <w:lang w:val="ru-RU"/>
-              </w:rPr>
-              <w:t>with app.app_context(): db.create_all()</w:t>
-            </w:r>
-          </w:p>
-          <w:p>
-            <w:pPr>
-              <w:pStyle w:val="Style21"/>
-              <w:rPr>
-                <w:lang w:val="ru-RU"/>
-              </w:rPr>
-            </w:pPr>
-            <w:r>
-              <w:rPr>
-                <w:lang w:val="ru-RU"/>
-              </w:rPr>
-              <w:t xml:space="preserve">    </w:t>
-            </w:r>
-            <w:r>
-              <w:rPr>
-                <w:lang w:val="ru-RU"/>
-              </w:rPr>
-              <w:t>app.run(**DevConfig().load())</w:t>
             </w:r>
           </w:p>
         </w:tc>
@@ -4190,14 +4044,14 @@
         <w:rPr>
           <w:sz w:val="28"/>
           <w:szCs w:val="28"/>
-          <w:lang w:val="en-US"/>
+          <w:lang w:val="ru-RU"/>
         </w:rPr>
       </w:pPr>
       <w:r>
         <w:rPr>
           <w:sz w:val="28"/>
           <w:szCs w:val="28"/>
-          <w:lang w:val="en-US"/>
+          <w:lang w:val="ru-RU"/>
         </w:rPr>
       </w:r>
     </w:p>
@@ -4219,7 +4073,7 @@
           <w:szCs w:val="28"/>
           <w:lang w:val="ru-RU"/>
         </w:rPr>
-        <w:t xml:space="preserve">После исправления кода и повторного запуска анализа </w:t>
+        <w:t xml:space="preserve">Таблица 4 – обновленный файл </w:t>
       </w:r>
       <w:r>
         <w:rPr>
@@ -4227,96 +4081,7 @@
           <w:szCs w:val="28"/>
           <w:lang w:val="en-US"/>
         </w:rPr>
-        <w:t xml:space="preserve">bandit </w:t>
-      </w:r>
-      <w:r>
-        <w:rPr>
-          <w:sz w:val="28"/>
-          <w:szCs w:val="28"/>
-          <w:lang w:val="ru-RU"/>
-        </w:rPr>
-        <w:t>было обнаружено, что все найденные до этого уязвимости были успешно закрыты (таблица 4).</w:t>
-      </w:r>
-    </w:p>
-    <w:p>
-      <w:pPr>
-        <w:pStyle w:val="Normal"/>
-        <w:spacing w:lineRule="auto" w:line="360" w:before="0" w:after="0"/>
-        <w:ind w:firstLine="709"/>
-        <w:jc w:val="both"/>
-        <w:rPr>
-          <w:sz w:val="28"/>
-          <w:szCs w:val="28"/>
-          <w:lang w:val="ru-RU"/>
-        </w:rPr>
-      </w:pPr>
-      <w:r>
-        <w:rPr>
-          <w:sz w:val="28"/>
-          <w:szCs w:val="28"/>
-          <w:lang w:val="ru-RU"/>
-        </w:rPr>
-      </w:r>
-    </w:p>
-    <w:p>
-      <w:pPr>
-        <w:pStyle w:val="Normal"/>
-        <w:spacing w:lineRule="auto" w:line="360" w:before="0" w:after="0"/>
-        <w:ind w:firstLine="709"/>
-        <w:jc w:val="both"/>
-        <w:rPr>
-          <w:sz w:val="28"/>
-          <w:szCs w:val="28"/>
-          <w:lang w:val="ru-RU"/>
-        </w:rPr>
-      </w:pPr>
-      <w:r>
-        <w:rPr>
-          <w:sz w:val="28"/>
-          <w:szCs w:val="28"/>
-          <w:lang w:val="ru-RU"/>
-        </w:rPr>
-        <w:t xml:space="preserve">Таблица 4 – </w:t>
-      </w:r>
-      <w:r>
-        <w:rPr>
-          <w:sz w:val="28"/>
-          <w:szCs w:val="28"/>
-          <w:lang w:val="ru-RU"/>
-        </w:rPr>
-        <w:t xml:space="preserve">содержимое </w:t>
-      </w:r>
-      <w:r>
-        <w:rPr>
-          <w:sz w:val="28"/>
-          <w:szCs w:val="28"/>
-          <w:lang w:val="en-US"/>
-        </w:rPr>
-        <w:t>JSON-</w:t>
-      </w:r>
-      <w:r>
-        <w:rPr>
-          <w:sz w:val="28"/>
-          <w:szCs w:val="28"/>
-          <w:lang w:val="ru-RU"/>
-        </w:rPr>
-        <w:t xml:space="preserve">файла отчета работы </w:t>
-      </w:r>
-      <w:r>
-        <w:rPr>
-          <w:sz w:val="28"/>
-          <w:szCs w:val="28"/>
-          <w:lang w:val="en-US"/>
-        </w:rPr>
-        <w:t xml:space="preserve">bandit </w:t>
-      </w:r>
-      <w:r>
-        <w:rPr>
-          <w:sz w:val="28"/>
-          <w:szCs w:val="28"/>
-          <w:lang w:val="ru-RU"/>
-        </w:rPr>
-        <w:t>после закрытия уязвимостей.</w:t>
+        <w:t>app.py</w:t>
       </w:r>
     </w:p>
     <w:tbl>
@@ -4349,7 +4114,318 @@
           </w:tcPr>
           <w:p>
             <w:pPr>
-              <w:pStyle w:val="Style21"/>
+              <w:pStyle w:val="user5"/>
+              <w:rPr/>
+            </w:pPr>
+            <w:r>
+              <w:rPr>
+                <w:lang w:val="en-US"/>
+              </w:rPr>
+              <w:t xml:space="preserve"># </w:t>
+            </w:r>
+            <w:r>
+              <w:rPr>
+                <w:lang w:val="ru-RU"/>
+              </w:rPr>
+              <w:t xml:space="preserve">Новые импорты для подгрузки </w:t>
+            </w:r>
+            <w:r>
+              <w:rPr>
+                <w:lang w:val="en-US"/>
+              </w:rPr>
+              <w:t>dev-</w:t>
+            </w:r>
+            <w:r>
+              <w:rPr>
+                <w:lang w:val="ru-RU"/>
+              </w:rPr>
+              <w:t>конфигурации</w:t>
+            </w:r>
+          </w:p>
+          <w:p>
+            <w:pPr>
+              <w:pStyle w:val="user5"/>
+              <w:rPr>
+                <w:lang w:val="ru-RU"/>
+              </w:rPr>
+            </w:pPr>
+            <w:r>
+              <w:rPr>
+                <w:lang w:val="ru-RU"/>
+              </w:rPr>
+              <w:t xml:space="preserve">from </w:t>
+            </w:r>
+            <w:r>
+              <w:rPr>
+                <w:lang w:val="en-US"/>
+              </w:rPr>
+              <w:t>src.config import Config, DevConfig</w:t>
+            </w:r>
+          </w:p>
+          <w:p>
+            <w:pPr>
+              <w:pStyle w:val="user5"/>
+              <w:rPr>
+                <w:lang w:val="ru-RU"/>
+              </w:rPr>
+            </w:pPr>
+            <w:r>
+              <w:rPr>
+                <w:lang w:val="en-US"/>
+              </w:rPr>
+              <w:t>…</w:t>
+            </w:r>
+          </w:p>
+          <w:p>
+            <w:pPr>
+              <w:pStyle w:val="user5"/>
+              <w:rPr>
+                <w:lang w:val="ru-RU"/>
+              </w:rPr>
+            </w:pPr>
+            <w:r>
+              <w:rPr>
+                <w:lang w:val="en-US"/>
+              </w:rPr>
+              <w:t>if __name__ == '__main__':</w:t>
+            </w:r>
+          </w:p>
+          <w:p>
+            <w:pPr>
+              <w:pStyle w:val="user5"/>
+              <w:rPr>
+                <w:lang w:val="ru-RU"/>
+              </w:rPr>
+            </w:pPr>
+            <w:r>
+              <w:rPr>
+                <w:lang w:val="en-US"/>
+              </w:rPr>
+              <w:t xml:space="preserve">    </w:t>
+            </w:r>
+            <w:r>
+              <w:rPr>
+                <w:lang w:val="en-US"/>
+              </w:rPr>
+              <w:t>with app.app_context(): db.create_all()</w:t>
+            </w:r>
+          </w:p>
+          <w:p>
+            <w:pPr>
+              <w:pStyle w:val="user5"/>
+              <w:rPr>
+                <w:lang w:val="ru-RU"/>
+              </w:rPr>
+            </w:pPr>
+            <w:r>
+              <w:rPr>
+                <w:lang w:val="en-US"/>
+              </w:rPr>
+              <w:t xml:space="preserve">    </w:t>
+            </w:r>
+            <w:r>
+              <w:rPr>
+                <w:lang w:val="en-US"/>
+              </w:rPr>
+              <w:t>app.run(**DevConfig().load())</w:t>
+            </w:r>
+          </w:p>
+        </w:tc>
+      </w:tr>
+    </w:tbl>
+    <w:p>
+      <w:pPr>
+        <w:pStyle w:val="Normal"/>
+        <w:spacing w:lineRule="auto" w:line="360" w:before="0" w:after="0"/>
+        <w:ind w:firstLine="709"/>
+        <w:jc w:val="both"/>
+        <w:rPr>
+          <w:sz w:val="28"/>
+          <w:szCs w:val="28"/>
+          <w:lang w:val="en-US"/>
+        </w:rPr>
+      </w:pPr>
+      <w:r>
+        <w:rPr>
+          <w:sz w:val="28"/>
+          <w:szCs w:val="28"/>
+          <w:lang w:val="en-US"/>
+        </w:rPr>
+      </w:r>
+    </w:p>
+    <w:p>
+      <w:pPr>
+        <w:pStyle w:val="Normal"/>
+        <w:spacing w:lineRule="auto" w:line="360" w:before="0" w:after="0"/>
+        <w:ind w:firstLine="709"/>
+        <w:jc w:val="both"/>
+        <w:rPr>
+          <w:sz w:val="28"/>
+          <w:szCs w:val="28"/>
+          <w:lang w:val="ru-RU"/>
+        </w:rPr>
+      </w:pPr>
+      <w:r>
+        <w:rPr>
+          <w:sz w:val="28"/>
+          <w:szCs w:val="28"/>
+          <w:lang w:val="ru-RU"/>
+        </w:rPr>
+        <w:t xml:space="preserve">После исправления кода и повторного запуска анализа </w:t>
+      </w:r>
+      <w:r>
+        <w:rPr>
+          <w:sz w:val="28"/>
+          <w:szCs w:val="28"/>
+          <w:lang w:val="en-US"/>
+        </w:rPr>
+        <w:t xml:space="preserve">bandit </w:t>
+      </w:r>
+      <w:r>
+        <w:rPr>
+          <w:sz w:val="28"/>
+          <w:szCs w:val="28"/>
+          <w:lang w:val="ru-RU"/>
+        </w:rPr>
+        <w:t xml:space="preserve">было обнаружено, что все найденные до этого уязвимости были успешно закрыты (таблица </w:t>
+      </w:r>
+      <w:r>
+        <w:rPr>
+          <w:sz w:val="28"/>
+          <w:szCs w:val="28"/>
+          <w:lang w:val="en-US"/>
+        </w:rPr>
+        <w:t>5</w:t>
+      </w:r>
+      <w:r>
+        <w:rPr>
+          <w:sz w:val="28"/>
+          <w:szCs w:val="28"/>
+          <w:lang w:val="ru-RU"/>
+        </w:rPr>
+        <w:t>).</w:t>
+      </w:r>
+    </w:p>
+    <w:p>
+      <w:pPr>
+        <w:pStyle w:val="Normal"/>
+        <w:spacing w:lineRule="auto" w:line="360" w:before="0" w:after="0"/>
+        <w:ind w:firstLine="709"/>
+        <w:jc w:val="both"/>
+        <w:rPr>
+          <w:sz w:val="28"/>
+          <w:szCs w:val="28"/>
+          <w:lang w:val="ru-RU"/>
+        </w:rPr>
+      </w:pPr>
+      <w:r>
+        <w:rPr>
+          <w:sz w:val="28"/>
+          <w:szCs w:val="28"/>
+          <w:lang w:val="ru-RU"/>
+        </w:rPr>
+      </w:r>
+    </w:p>
+    <w:p>
+      <w:pPr>
+        <w:pStyle w:val="Normal"/>
+        <w:spacing w:lineRule="auto" w:line="360" w:before="0" w:after="0"/>
+        <w:ind w:firstLine="709"/>
+        <w:jc w:val="both"/>
+        <w:rPr>
+          <w:sz w:val="28"/>
+          <w:szCs w:val="28"/>
+          <w:lang w:val="ru-RU"/>
+        </w:rPr>
+      </w:pPr>
+      <w:r>
+        <w:rPr>
+          <w:sz w:val="28"/>
+          <w:szCs w:val="28"/>
+          <w:lang w:val="ru-RU"/>
+        </w:rPr>
+        <w:t xml:space="preserve">Таблица </w:t>
+      </w:r>
+      <w:r>
+        <w:rPr>
+          <w:sz w:val="28"/>
+          <w:szCs w:val="28"/>
+          <w:lang w:val="en-US"/>
+        </w:rPr>
+        <w:t>5</w:t>
+      </w:r>
+      <w:r>
+        <w:rPr>
+          <w:sz w:val="28"/>
+          <w:szCs w:val="28"/>
+          <w:lang w:val="ru-RU"/>
+        </w:rPr>
+        <w:t xml:space="preserve"> – содержимое </w:t>
+      </w:r>
+      <w:r>
+        <w:rPr>
+          <w:sz w:val="28"/>
+          <w:szCs w:val="28"/>
+          <w:lang w:val="en-US"/>
+        </w:rPr>
+        <w:t>JSON-</w:t>
+      </w:r>
+      <w:r>
+        <w:rPr>
+          <w:sz w:val="28"/>
+          <w:szCs w:val="28"/>
+          <w:lang w:val="ru-RU"/>
+        </w:rPr>
+        <w:t xml:space="preserve">файла отчета работы </w:t>
+      </w:r>
+      <w:r>
+        <w:rPr>
+          <w:sz w:val="28"/>
+          <w:szCs w:val="28"/>
+          <w:lang w:val="en-US"/>
+        </w:rPr>
+        <w:t xml:space="preserve">bandit </w:t>
+      </w:r>
+      <w:r>
+        <w:rPr>
+          <w:sz w:val="28"/>
+          <w:szCs w:val="28"/>
+          <w:lang w:val="ru-RU"/>
+        </w:rPr>
+        <w:t>после закрытия уязвимостей.</w:t>
+      </w:r>
+    </w:p>
+    <w:tbl>
+      <w:tblPr>
+        <w:tblW w:w="5000" w:type="pct"/>
+        <w:jc w:val="left"/>
+        <w:tblInd w:w="55" w:type="dxa"/>
+        <w:tblLayout w:type="fixed"/>
+        <w:tblCellMar>
+          <w:top w:w="55" w:type="dxa"/>
+          <w:left w:w="55" w:type="dxa"/>
+          <w:bottom w:w="55" w:type="dxa"/>
+          <w:right w:w="55" w:type="dxa"/>
+        </w:tblCellMar>
+      </w:tblPr>
+      <w:tblGrid>
+        <w:gridCol w:w="9637"/>
+      </w:tblGrid>
+      <w:tr>
+        <w:trPr/>
+        <w:tc>
+          <w:tcPr>
+            <w:tcW w:w="9637" w:type="dxa"/>
+            <w:tcBorders>
+              <w:top w:val="single" w:sz="4" w:space="0" w:color="000000"/>
+              <w:left w:val="single" w:sz="4" w:space="0" w:color="000000"/>
+              <w:bottom w:val="single" w:sz="4" w:space="0" w:color="000000"/>
+              <w:right w:val="single" w:sz="4" w:space="0" w:color="000000"/>
+            </w:tcBorders>
+          </w:tcPr>
+          <w:p>
+            <w:pPr>
+              <w:pStyle w:val="user5"/>
               <w:rPr/>
             </w:pPr>
             <w:r>
@@ -4359,7 +4435,7 @@
           </w:p>
           <w:p>
             <w:pPr>
-              <w:pStyle w:val="Style21"/>
+              <w:pStyle w:val="user5"/>
               <w:rPr/>
             </w:pPr>
             <w:r>
@@ -4373,7 +4449,7 @@
           </w:p>
           <w:p>
             <w:pPr>
-              <w:pStyle w:val="Style21"/>
+              <w:pStyle w:val="user5"/>
               <w:rPr/>
             </w:pPr>
             <w:r>
@@ -4387,7 +4463,7 @@
           </w:p>
           <w:p>
             <w:pPr>
-              <w:pStyle w:val="Style21"/>
+              <w:pStyle w:val="user5"/>
               <w:rPr/>
             </w:pPr>
             <w:r>
@@ -4401,7 +4477,7 @@
           </w:p>
           <w:p>
             <w:pPr>
-              <w:pStyle w:val="Style21"/>
+              <w:pStyle w:val="user5"/>
               <w:rPr/>
             </w:pPr>
             <w:r>
@@ -4415,7 +4491,7 @@
           </w:p>
           <w:p>
             <w:pPr>
-              <w:pStyle w:val="Style21"/>
+              <w:pStyle w:val="user5"/>
               <w:rPr/>
             </w:pPr>
             <w:r>
@@ -4429,7 +4505,7 @@
           </w:p>
           <w:p>
             <w:pPr>
-              <w:pStyle w:val="Style21"/>
+              <w:pStyle w:val="user5"/>
               <w:rPr/>
             </w:pPr>
             <w:r>
@@ -4443,7 +4519,7 @@
           </w:p>
           <w:p>
             <w:pPr>
-              <w:pStyle w:val="Style21"/>
+              <w:pStyle w:val="user5"/>
               <w:rPr/>
             </w:pPr>
             <w:r>
@@ -4457,7 +4533,7 @@
           </w:p>
           <w:p>
             <w:pPr>
-              <w:pStyle w:val="Style21"/>
+              <w:pStyle w:val="user5"/>
               <w:rPr/>
             </w:pPr>
             <w:r>
@@ -4471,7 +4547,7 @@
           </w:p>
           <w:p>
             <w:pPr>
-              <w:pStyle w:val="Style21"/>
+              <w:pStyle w:val="user5"/>
               <w:rPr/>
             </w:pPr>
             <w:r>
@@ -4485,7 +4561,7 @@
           </w:p>
           <w:p>
             <w:pPr>
-              <w:pStyle w:val="Style21"/>
+              <w:pStyle w:val="user5"/>
               <w:rPr/>
             </w:pPr>
             <w:r>
@@ -4499,7 +4575,7 @@
           </w:p>
           <w:p>
             <w:pPr>
-              <w:pStyle w:val="Style21"/>
+              <w:pStyle w:val="user5"/>
               <w:rPr/>
             </w:pPr>
             <w:r>
@@ -4513,7 +4589,7 @@
           </w:p>
           <w:p>
             <w:pPr>
-              <w:pStyle w:val="Style21"/>
+              <w:pStyle w:val="user5"/>
               <w:rPr/>
             </w:pPr>
             <w:r>
@@ -4527,7 +4603,7 @@
           </w:p>
           <w:p>
             <w:pPr>
-              <w:pStyle w:val="Style21"/>
+              <w:pStyle w:val="user5"/>
               <w:rPr/>
             </w:pPr>
             <w:r>
@@ -4541,7 +4617,7 @@
           </w:p>
           <w:p>
             <w:pPr>
-              <w:pStyle w:val="Style21"/>
+              <w:pStyle w:val="user5"/>
               <w:rPr/>
             </w:pPr>
             <w:r>
@@ -4555,7 +4631,7 @@
           </w:p>
           <w:p>
             <w:pPr>
-              <w:pStyle w:val="Style21"/>
+              <w:pStyle w:val="user5"/>
               <w:rPr/>
             </w:pPr>
             <w:r>
@@ -4569,7 +4645,7 @@
           </w:p>
           <w:p>
             <w:pPr>
-              <w:pStyle w:val="Style21"/>
+              <w:pStyle w:val="user5"/>
               <w:rPr/>
             </w:pPr>
             <w:r>
@@ -4583,7 +4659,7 @@
           </w:p>
           <w:p>
             <w:pPr>
-              <w:pStyle w:val="Style21"/>
+              <w:pStyle w:val="user5"/>
               <w:rPr/>
             </w:pPr>
             <w:r>
@@ -4597,7 +4673,7 @@
           </w:p>
           <w:p>
             <w:pPr>
-              <w:pStyle w:val="Style21"/>
+              <w:pStyle w:val="user5"/>
               <w:rPr/>
             </w:pPr>
             <w:r>
@@ -4611,7 +4687,7 @@
           </w:p>
           <w:p>
             <w:pPr>
-              <w:pStyle w:val="Style21"/>
+              <w:pStyle w:val="user5"/>
               <w:rPr/>
             </w:pPr>
             <w:r>
@@ -4625,7 +4701,7 @@
           </w:p>
           <w:p>
             <w:pPr>
-              <w:pStyle w:val="Style21"/>
+              <w:pStyle w:val="user5"/>
               <w:rPr/>
             </w:pPr>
             <w:r>
@@ -4639,7 +4715,7 @@
           </w:p>
           <w:p>
             <w:pPr>
-              <w:pStyle w:val="Style21"/>
+              <w:pStyle w:val="user5"/>
               <w:rPr/>
             </w:pPr>
             <w:r>
@@ -4653,7 +4729,7 @@
           </w:p>
           <w:p>
             <w:pPr>
-              <w:pStyle w:val="Style21"/>
+              <w:pStyle w:val="user5"/>
               <w:rPr/>
             </w:pPr>
             <w:r>
@@ -4667,7 +4743,7 @@
           </w:p>
           <w:p>
             <w:pPr>
-              <w:pStyle w:val="Style21"/>
+              <w:pStyle w:val="user5"/>
               <w:rPr/>
             </w:pPr>
             <w:r>
@@ -4681,7 +4757,7 @@
           </w:p>
           <w:p>
             <w:pPr>
-              <w:pStyle w:val="Style21"/>
+              <w:pStyle w:val="user5"/>
               <w:rPr/>
             </w:pPr>
             <w:r>
@@ -4695,7 +4771,7 @@
           </w:p>
           <w:p>
             <w:pPr>
-              <w:pStyle w:val="Style21"/>
+              <w:pStyle w:val="user5"/>
               <w:rPr/>
             </w:pPr>
             <w:r>
@@ -4709,7 +4785,7 @@
           </w:p>
           <w:p>
             <w:pPr>
-              <w:pStyle w:val="Style21"/>
+              <w:pStyle w:val="user5"/>
               <w:rPr/>
             </w:pPr>
             <w:r>
@@ -4723,7 +4799,7 @@
           </w:p>
           <w:p>
             <w:pPr>
-              <w:pStyle w:val="Style21"/>
+              <w:pStyle w:val="user5"/>
               <w:rPr/>
             </w:pPr>
             <w:r>
@@ -4737,7 +4813,7 @@
           </w:p>
           <w:p>
             <w:pPr>
-              <w:pStyle w:val="Style21"/>
+              <w:pStyle w:val="user5"/>
               <w:rPr/>
             </w:pPr>
             <w:r>
@@ -4751,7 +4827,7 @@
           </w:p>
           <w:p>
             <w:pPr>
-              <w:pStyle w:val="Style21"/>
+              <w:pStyle w:val="user5"/>
               <w:rPr/>
             </w:pPr>
             <w:r>
@@ -4765,7 +4841,7 @@
           </w:p>
           <w:p>
             <w:pPr>
-              <w:pStyle w:val="Style21"/>
+              <w:pStyle w:val="user5"/>
               <w:rPr/>
             </w:pPr>
             <w:r>
@@ -4779,7 +4855,7 @@
           </w:p>
           <w:p>
             <w:pPr>
-              <w:pStyle w:val="Style21"/>
+              <w:pStyle w:val="user5"/>
               <w:rPr/>
             </w:pPr>
             <w:r>
@@ -4793,7 +4869,7 @@
           </w:p>
           <w:p>
             <w:pPr>
-              <w:pStyle w:val="Style21"/>
+              <w:pStyle w:val="user5"/>
               <w:rPr/>
             </w:pPr>
             <w:r>
@@ -4807,7 +4883,7 @@
           </w:p>
           <w:p>
             <w:pPr>
-              <w:pStyle w:val="Style21"/>
+              <w:pStyle w:val="user5"/>
               <w:rPr/>
             </w:pPr>
             <w:r>
@@ -4821,7 +4897,7 @@
           </w:p>
           <w:p>
             <w:pPr>
-              <w:pStyle w:val="Style21"/>
+              <w:pStyle w:val="user5"/>
               <w:rPr/>
             </w:pPr>
             <w:r>
@@ -4835,7 +4911,7 @@
           </w:p>
           <w:p>
             <w:pPr>
-              <w:pStyle w:val="Style21"/>
+              <w:pStyle w:val="user5"/>
               <w:rPr/>
             </w:pPr>
             <w:r>
@@ -4849,7 +4925,7 @@
           </w:p>
           <w:p>
             <w:pPr>
-              <w:pStyle w:val="Style21"/>
+              <w:pStyle w:val="user5"/>
               <w:rPr/>
             </w:pPr>
             <w:r>
@@ -4863,7 +4939,7 @@
           </w:p>
           <w:p>
             <w:pPr>
-              <w:pStyle w:val="Style21"/>
+              <w:pStyle w:val="user5"/>
               <w:rPr/>
             </w:pPr>
             <w:r>
@@ -4877,7 +4953,7 @@
           </w:p>
           <w:p>
             <w:pPr>
-              <w:pStyle w:val="Style21"/>
+              <w:pStyle w:val="user5"/>
               <w:rPr/>
             </w:pPr>
             <w:r>
@@ -4891,7 +4967,7 @@
           </w:p>
           <w:p>
             <w:pPr>
-              <w:pStyle w:val="Style21"/>
+              <w:pStyle w:val="user5"/>
               <w:rPr/>
             </w:pPr>
             <w:r>
@@ -4905,7 +4981,7 @@
           </w:p>
           <w:p>
             <w:pPr>
-              <w:pStyle w:val="Style21"/>
+              <w:pStyle w:val="user5"/>
               <w:rPr/>
             </w:pPr>
             <w:r>
@@ -4919,7 +4995,7 @@
           </w:p>
           <w:p>
             <w:pPr>
-              <w:pStyle w:val="Style21"/>
+              <w:pStyle w:val="user5"/>
               <w:rPr/>
             </w:pPr>
             <w:r>
@@ -4933,7 +5009,7 @@
           </w:p>
           <w:p>
             <w:pPr>
-              <w:pStyle w:val="Style21"/>
+              <w:pStyle w:val="user5"/>
               <w:rPr/>
             </w:pPr>
             <w:r>
@@ -4947,7 +5023,7 @@
           </w:p>
           <w:p>
             <w:pPr>
-              <w:pStyle w:val="Style21"/>
+              <w:pStyle w:val="user5"/>
               <w:rPr/>
             </w:pPr>
             <w:r>
@@ -4961,7 +5037,7 @@
           </w:p>
           <w:p>
             <w:pPr>
-              <w:pStyle w:val="Style21"/>
+              <w:pStyle w:val="user5"/>
               <w:rPr/>
             </w:pPr>
             <w:r>
@@ -4975,7 +5051,7 @@
           </w:p>
           <w:p>
             <w:pPr>
-              <w:pStyle w:val="Style21"/>
+              <w:pStyle w:val="user5"/>
               <w:rPr/>
             </w:pPr>
             <w:r>
@@ -4989,7 +5065,7 @@
           </w:p>
           <w:p>
             <w:pPr>
-              <w:pStyle w:val="Style21"/>
+              <w:pStyle w:val="user5"/>
               <w:rPr/>
             </w:pPr>
             <w:r>
@@ -5003,7 +5079,7 @@
           </w:p>
           <w:p>
             <w:pPr>
-              <w:pStyle w:val="Style21"/>
+              <w:pStyle w:val="user5"/>
               <w:rPr/>
             </w:pPr>
             <w:r>
@@ -5017,7 +5093,7 @@
           </w:p>
           <w:p>
             <w:pPr>
-              <w:pStyle w:val="Style21"/>
+              <w:pStyle w:val="user5"/>
               <w:rPr/>
             </w:pPr>
             <w:r>
@@ -5031,7 +5107,7 @@
           </w:p>
           <w:p>
             <w:pPr>
-              <w:pStyle w:val="Style21"/>
+              <w:pStyle w:val="user5"/>
               <w:rPr/>
             </w:pPr>
             <w:r>
@@ -5045,7 +5121,7 @@
           </w:p>
           <w:p>
             <w:pPr>
-              <w:pStyle w:val="Style21"/>
+              <w:pStyle w:val="user5"/>
               <w:rPr/>
             </w:pPr>
             <w:r>
@@ -5059,7 +5135,7 @@
           </w:p>
           <w:p>
             <w:pPr>
-              <w:pStyle w:val="Style21"/>
+              <w:pStyle w:val="user5"/>
               <w:rPr/>
             </w:pPr>
             <w:r>
@@ -5073,7 +5149,7 @@
           </w:p>
           <w:p>
             <w:pPr>
-              <w:pStyle w:val="Style21"/>
+              <w:pStyle w:val="user5"/>
               <w:rPr/>
             </w:pPr>
             <w:r>
@@ -5087,7 +5163,7 @@
           </w:p>
           <w:p>
             <w:pPr>
-              <w:pStyle w:val="Style21"/>
+              <w:pStyle w:val="user5"/>
               <w:rPr/>
             </w:pPr>
             <w:r>
@@ -5101,7 +5177,7 @@
           </w:p>
           <w:p>
             <w:pPr>
-              <w:pStyle w:val="Style21"/>
+              <w:pStyle w:val="user5"/>
               <w:rPr/>
             </w:pPr>
             <w:r>
@@ -5115,7 +5191,7 @@
           </w:p>
           <w:p>
             <w:pPr>
-              <w:pStyle w:val="Style21"/>
+              <w:pStyle w:val="user5"/>
               <w:rPr/>
             </w:pPr>
             <w:r>
@@ -5129,7 +5205,7 @@
           </w:p>
           <w:p>
             <w:pPr>
-              <w:pStyle w:val="Style21"/>
+              <w:pStyle w:val="user5"/>
               <w:rPr/>
             </w:pPr>
             <w:r>
@@ -5143,7 +5219,7 @@
           </w:p>
           <w:p>
             <w:pPr>
-              <w:pStyle w:val="Style21"/>
+              <w:pStyle w:val="user5"/>
               <w:rPr/>
             </w:pPr>
             <w:r>
@@ -5157,7 +5233,7 @@
           </w:p>
           <w:p>
             <w:pPr>
-              <w:pStyle w:val="Style21"/>
+              <w:pStyle w:val="user5"/>
               <w:rPr/>
             </w:pPr>
             <w:r>
@@ -5171,7 +5247,7 @@
           </w:p>
           <w:p>
             <w:pPr>
-              <w:pStyle w:val="Style21"/>
+              <w:pStyle w:val="user5"/>
               <w:rPr/>
             </w:pPr>
             <w:r>
@@ -5185,7 +5261,7 @@
           </w:p>
           <w:p>
             <w:pPr>
-              <w:pStyle w:val="Style21"/>
+              <w:pStyle w:val="user5"/>
               <w:rPr/>
             </w:pPr>
             <w:r>
@@ -5199,7 +5275,7 @@
           </w:p>
           <w:p>
             <w:pPr>
-              <w:pStyle w:val="Style21"/>
+              <w:pStyle w:val="user5"/>
               <w:rPr/>
             </w:pPr>
             <w:r>
@@ -5213,7 +5289,7 @@
           </w:p>
           <w:p>
             <w:pPr>
-              <w:pStyle w:val="Style21"/>
+              <w:pStyle w:val="user5"/>
               <w:rPr/>
             </w:pPr>
             <w:r>
@@ -5227,7 +5303,7 @@
           </w:p>
           <w:p>
             <w:pPr>
-              <w:pStyle w:val="Style21"/>
+              <w:pStyle w:val="user5"/>
               <w:rPr/>
             </w:pPr>
             <w:r>
@@ -5241,7 +5317,7 @@
           </w:p>
           <w:p>
             <w:pPr>
-              <w:pStyle w:val="Style21"/>
+              <w:pStyle w:val="user5"/>
               <w:rPr/>
             </w:pPr>
             <w:r>
@@ -5255,7 +5331,7 @@
           </w:p>
           <w:p>
             <w:pPr>
-              <w:pStyle w:val="Style21"/>
+              <w:pStyle w:val="user5"/>
               <w:rPr/>
             </w:pPr>
             <w:r>
@@ -5269,7 +5345,7 @@
           </w:p>
           <w:p>
             <w:pPr>
-              <w:pStyle w:val="Style21"/>
+              <w:pStyle w:val="user5"/>
               <w:rPr/>
             </w:pPr>
             <w:r>
@@ -5283,7 +5359,7 @@
           </w:p>
           <w:p>
             <w:pPr>
-              <w:pStyle w:val="Style21"/>
+              <w:pStyle w:val="user5"/>
               <w:rPr/>
             </w:pPr>
             <w:r>
@@ -5297,7 +5373,7 @@
           </w:p>
           <w:p>
             <w:pPr>
-              <w:pStyle w:val="Style21"/>
+              <w:pStyle w:val="user5"/>
               <w:rPr/>
             </w:pPr>
             <w:r>
@@ -5311,7 +5387,7 @@
           </w:p>
           <w:p>
             <w:pPr>
-              <w:pStyle w:val="Style21"/>
+              <w:pStyle w:val="user5"/>
               <w:rPr/>
             </w:pPr>
             <w:r>
@@ -5325,7 +5401,7 @@
           </w:p>
           <w:p>
             <w:pPr>
-              <w:pStyle w:val="Style21"/>
+              <w:pStyle w:val="user5"/>
               <w:rPr/>
             </w:pPr>
             <w:r>
@@ -5339,7 +5415,7 @@
           </w:p>
           <w:p>
             <w:pPr>
-              <w:pStyle w:val="Style21"/>
+              <w:pStyle w:val="user5"/>
               <w:rPr/>
             </w:pPr>
             <w:r>
@@ -5353,7 +5429,7 @@
           </w:p>
           <w:p>
             <w:pPr>
-              <w:pStyle w:val="Style21"/>
+              <w:pStyle w:val="user5"/>
               <w:rPr/>
             </w:pPr>
             <w:r>
@@ -5367,7 +5443,7 @@
           </w:p>
           <w:p>
             <w:pPr>
-              <w:pStyle w:val="Style21"/>
+              <w:pStyle w:val="user5"/>
               <w:rPr/>
             </w:pPr>
             <w:r>
@@ -5381,7 +5457,7 @@
           </w:p>
           <w:p>
             <w:pPr>
-              <w:pStyle w:val="Style21"/>
+              <w:pStyle w:val="user5"/>
               <w:rPr/>
             </w:pPr>
             <w:r>
@@ -5395,7 +5471,7 @@
           </w:p>
           <w:p>
             <w:pPr>
-              <w:pStyle w:val="Style21"/>
+              <w:pStyle w:val="user5"/>
               <w:rPr/>
             </w:pPr>
             <w:r>
@@ -5409,7 +5485,7 @@
           </w:p>
           <w:p>
             <w:pPr>
-              <w:pStyle w:val="Style21"/>
+              <w:pStyle w:val="user5"/>
               <w:rPr/>
             </w:pPr>
             <w:r>
@@ -5423,7 +5499,7 @@
           </w:p>
           <w:p>
             <w:pPr>
-              <w:pStyle w:val="Style21"/>
+              <w:pStyle w:val="user5"/>
               <w:rPr/>
             </w:pPr>
             <w:r>
@@ -5437,7 +5513,7 @@
           </w:p>
           <w:p>
             <w:pPr>
-              <w:pStyle w:val="Style21"/>
+              <w:pStyle w:val="user5"/>
               <w:rPr/>
             </w:pPr>
             <w:r>
@@ -5451,7 +5527,7 @@
           </w:p>
           <w:p>
             <w:pPr>
-              <w:pStyle w:val="Style21"/>
+              <w:pStyle w:val="user5"/>
               <w:rPr/>
             </w:pPr>
             <w:r>
@@ -5465,7 +5541,7 @@
           </w:p>
           <w:p>
             <w:pPr>
-              <w:pStyle w:val="Style21"/>
+              <w:pStyle w:val="user5"/>
               <w:rPr/>
             </w:pPr>
             <w:r>
@@ -5479,7 +5555,7 @@
           </w:p>
           <w:p>
             <w:pPr>
-              <w:pStyle w:val="Style21"/>
+              <w:pStyle w:val="user5"/>
               <w:rPr/>
             </w:pPr>
             <w:r>
@@ -5493,7 +5569,7 @@
           </w:p>
           <w:p>
             <w:pPr>
-              <w:pStyle w:val="Style21"/>
+              <w:pStyle w:val="user5"/>
               <w:rPr/>
             </w:pPr>
             <w:r>
@@ -5507,7 +5583,7 @@
           </w:p>
           <w:p>
             <w:pPr>
-              <w:pStyle w:val="Style21"/>
+              <w:pStyle w:val="user5"/>
               <w:rPr/>
             </w:pPr>
             <w:r>
@@ -5521,7 +5597,7 @@
           </w:p>
           <w:p>
             <w:pPr>
-              <w:pStyle w:val="Style21"/>
+              <w:pStyle w:val="user5"/>
               <w:rPr/>
             </w:pPr>
             <w:r>
@@ -5780,7 +5856,23 @@
           <w:szCs w:val="28"/>
           <w:lang w:val="ru-RU"/>
         </w:rPr>
-        <w:t>таблица 5).</w:t>
+        <w:t xml:space="preserve">таблица </w:t>
+      </w:r>
+      <w:r>
+        <w:rPr>
+          <w:sz w:val="28"/>
+          <w:szCs w:val="28"/>
+          <w:lang w:val="en-US"/>
+        </w:rPr>
+        <w:t>6</w:t>
+      </w:r>
+      <w:r>
+        <w:rPr>
+          <w:sz w:val="28"/>
+          <w:szCs w:val="28"/>
+          <w:lang w:val="ru-RU"/>
+        </w:rPr>
+        <w:t>).</w:t>
       </w:r>
     </w:p>
     <w:p>
@@ -5821,7 +5913,23 @@
           <w:szCs w:val="28"/>
           <w:lang w:val="ru-RU"/>
         </w:rPr>
-        <w:t xml:space="preserve">Таблица 5 – конфигурация </w:t>
+        <w:t xml:space="preserve">Таблица </w:t>
+      </w:r>
+      <w:r>
+        <w:rPr>
+          <w:sz w:val="28"/>
+          <w:szCs w:val="28"/>
+          <w:lang w:val="en-US"/>
+        </w:rPr>
+        <w:t>6</w:t>
+      </w:r>
+      <w:r>
+        <w:rPr>
+          <w:sz w:val="28"/>
+          <w:szCs w:val="28"/>
+          <w:lang w:val="ru-RU"/>
+        </w:rPr>
+        <w:t xml:space="preserve"> – конфигурация </w:t>
       </w:r>
       <w:r>
         <w:rPr>
@@ -5894,7 +6002,7 @@
           </w:tcPr>
           <w:p>
             <w:pPr>
-              <w:pStyle w:val="Style21"/>
+              <w:pStyle w:val="user5"/>
               <w:rPr/>
             </w:pPr>
             <w:r>
@@ -5904,7 +6012,7 @@
           </w:p>
           <w:p>
             <w:pPr>
-              <w:pStyle w:val="Style21"/>
+              <w:pStyle w:val="user5"/>
               <w:rPr/>
             </w:pPr>
             <w:r>
@@ -5918,7 +6026,7 @@
           </w:p>
           <w:p>
             <w:pPr>
-              <w:pStyle w:val="Style21"/>
+              <w:pStyle w:val="user5"/>
               <w:rPr/>
             </w:pPr>
             <w:r>
@@ -5932,7 +6040,7 @@
           </w:p>
           <w:p>
             <w:pPr>
-              <w:pStyle w:val="Style21"/>
+              <w:pStyle w:val="user5"/>
               <w:rPr/>
             </w:pPr>
             <w:r>
@@ -5946,7 +6054,7 @@
           </w:p>
           <w:p>
             <w:pPr>
-              <w:pStyle w:val="Style21"/>
+              <w:pStyle w:val="user5"/>
               <w:rPr/>
             </w:pPr>
             <w:r>
@@ -5960,7 +6068,7 @@
           </w:p>
           <w:p>
             <w:pPr>
-              <w:pStyle w:val="Style21"/>
+              <w:pStyle w:val="user5"/>
               <w:rPr/>
             </w:pPr>
             <w:r>
@@ -5974,7 +6082,7 @@
           </w:p>
           <w:p>
             <w:pPr>
-              <w:pStyle w:val="Style21"/>
+              <w:pStyle w:val="user5"/>
               <w:rPr/>
             </w:pPr>
             <w:r>
@@ -5988,7 +6096,7 @@
           </w:p>
           <w:p>
             <w:pPr>
-              <w:pStyle w:val="Style21"/>
+              <w:pStyle w:val="user5"/>
               <w:rPr/>
             </w:pPr>
             <w:r>
@@ -6002,7 +6110,7 @@
           </w:p>
           <w:p>
             <w:pPr>
-              <w:pStyle w:val="Style21"/>
+              <w:pStyle w:val="user5"/>
               <w:rPr/>
             </w:pPr>
             <w:r>
@@ -6134,30 +6242,35 @@
                           <w:r>
                             <w:rPr>
                               <w:rStyle w:val="PageNumber"/>
+                              <w:color w:val="000000"/>
                             </w:rPr>
                             <w:fldChar w:fldCharType="begin"/>
                           </w:r>
                           <w:r>
                             <w:rPr>
                               <w:rStyle w:val="PageNumber"/>
+                              <w:color w:val="000000"/>
                             </w:rPr>
                             <w:instrText xml:space="preserve"> PAGE </w:instrText>
                           </w:r>
                           <w:r>
                             <w:rPr>
                               <w:rStyle w:val="PageNumber"/>
+                              <w:color w:val="000000"/>
                             </w:rPr>
                             <w:fldChar w:fldCharType="separate"/>
                           </w:r>
                           <w:r>
                             <w:rPr>
                               <w:rStyle w:val="PageNumber"/>
+                              <w:color w:val="000000"/>
                             </w:rPr>
                             <w:t>0</w:t>
                           </w:r>
                           <w:r>
                             <w:rPr>
                               <w:rStyle w:val="PageNumber"/>
+                              <w:color w:val="000000"/>
                             </w:rPr>
                             <w:fldChar w:fldCharType="end"/>
                           </w:r>
@@ -6175,8 +6288,8 @@
         </mc:Choice>
         <mc:Fallback>
           <w:pict>
-            <v:rect id="shape_0" fillcolor="white" stroked="f" o:allowincell="f" style="position:absolute;margin-left:0pt;margin-top:0.05pt;width:1.1pt;height:1.1pt;mso-wrap-style:square;v-text-anchor:top;mso-position-horizontal:right;mso-position-horizontal-relative:margin">
-              <v:fill o:detectmouseclick="t" type="solid" color2="black" opacity="0"/>
+            <v:rect id="shape_0" stroked="f" o:allowincell="f" style="position:absolute;margin-left:0pt;margin-top:0.05pt;width:1.1pt;height:1.1pt;mso-wrap-style:square;v-text-anchor:top;mso-position-horizontal:right;mso-position-horizontal-relative:margin">
+              <v:fill o:detectmouseclick="t" on="false"/>
               <v:stroke color="#3465a4" joinstyle="round" endcap="flat"/>
               <v:textbox>
                 <w:txbxContent>
@@ -6190,30 +6303,35 @@
                     <w:r>
                       <w:rPr>
                         <w:rStyle w:val="PageNumber"/>
+                        <w:color w:val="000000"/>
                       </w:rPr>
                       <w:fldChar w:fldCharType="begin"/>
                     </w:r>
                     <w:r>
                       <w:rPr>
                         <w:rStyle w:val="PageNumber"/>
+                        <w:color w:val="000000"/>
                       </w:rPr>
                       <w:instrText xml:space="preserve"> PAGE </w:instrText>
                     </w:r>
                     <w:r>
                       <w:rPr>
                         <w:rStyle w:val="PageNumber"/>
+                        <w:color w:val="000000"/>
                       </w:rPr>
                       <w:fldChar w:fldCharType="separate"/>
                     </w:r>
                     <w:r>
                       <w:rPr>
                         <w:rStyle w:val="PageNumber"/>
+                        <w:color w:val="000000"/>
                       </w:rPr>
                       <w:t>0</w:t>
                     </w:r>
                     <w:r>
                       <w:rPr>
                         <w:rStyle w:val="PageNumber"/>
+                        <w:color w:val="000000"/>
                       </w:rPr>
                       <w:fldChar w:fldCharType="end"/>
                     </w:r>
@@ -7207,9 +7325,8 @@
       <w:szCs w:val="20"/>
     </w:rPr>
   </w:style>
-  <w:style w:type="character" w:styleId="user">
-    <w:name w:val="Символ сноски (user)"/>
-    <w:basedOn w:val="DefaultParagraphFont"/>
+  <w:style w:type="character" w:styleId="Style15">
+    <w:name w:val="Символ сноски"/>
     <w:semiHidden/>
     <w:qFormat/>
     <w:rsid w:val="00454f0c"/>
@@ -7218,8 +7335,8 @@
       <w:vertAlign w:val="superscript"/>
     </w:rPr>
   </w:style>
-  <w:style w:type="character" w:styleId="Style15">
-    <w:name w:val="Символ сноски"/>
+  <w:style w:type="character" w:styleId="user">
+    <w:name w:val="Символ сноски (user)"/>
     <w:qFormat/>
     <w:rPr>
       <w:rFonts w:cs="Times New Roman"/>
@@ -7287,14 +7404,14 @@
       <w:rFonts w:ascii="Courier New" w:hAnsi="Courier New" w:cs="Courier New"/>
     </w:rPr>
   </w:style>
-  <w:style w:type="character" w:styleId="user1">
-    <w:name w:val="Маркеры (user)"/>
+  <w:style w:type="character" w:styleId="Style17">
+    <w:name w:val="Маркеры"/>
     <w:qFormat/>
     <w:rPr>
       <w:rFonts w:ascii="OpenSymbol" w:hAnsi="OpenSymbol" w:eastAsia="OpenSymbol" w:cs="OpenSymbol"/>
     </w:rPr>
   </w:style>
-  <w:style w:type="paragraph" w:styleId="Style17">
+  <w:style w:type="paragraph" w:styleId="Style18">
     <w:name w:val="Заголовок"/>
     <w:basedOn w:val="Normal"/>
     <w:next w:val="BodyText"/>
@@ -7349,7 +7466,7 @@
       <w:szCs w:val="24"/>
     </w:rPr>
   </w:style>
-  <w:style w:type="paragraph" w:styleId="Style18">
+  <w:style w:type="paragraph" w:styleId="Style19">
     <w:name w:val="Указатель"/>
     <w:basedOn w:val="Normal"/>
     <w:qFormat/>
@@ -7360,7 +7477,7 @@
       <w:rFonts w:cs="Arial"/>
     </w:rPr>
   </w:style>
-  <w:style w:type="paragraph" w:styleId="user2">
+  <w:style w:type="paragraph" w:styleId="user1">
     <w:name w:val="Заголовок (user)"/>
     <w:basedOn w:val="Normal"/>
     <w:next w:val="BodyText"/>
@@ -7375,7 +7492,7 @@
       <w:szCs w:val="28"/>
     </w:rPr>
   </w:style>
-  <w:style w:type="paragraph" w:styleId="user3">
+  <w:style w:type="paragraph" w:styleId="user2">
     <w:name w:val="Указатель (user)"/>
     <w:basedOn w:val="Normal"/>
     <w:qFormat/>
@@ -7408,15 +7525,15 @@
     </w:pPr>
     <w:rPr/>
   </w:style>
-  <w:style w:type="paragraph" w:styleId="user4">
-    <w:name w:val="Колонтитулы (user)"/>
+  <w:style w:type="paragraph" w:styleId="Style20">
+    <w:name w:val="Колонтитулы"/>
     <w:basedOn w:val="Normal"/>
     <w:qFormat/>
     <w:pPr/>
     <w:rPr/>
   </w:style>
-  <w:style w:type="paragraph" w:styleId="Style19">
-    <w:name w:val="Колонтитулы"/>
+  <w:style w:type="paragraph" w:styleId="user3">
+    <w:name w:val="Колонтитулы (user)"/>
     <w:basedOn w:val="Normal"/>
     <w:qFormat/>
     <w:pPr/>
@@ -7776,14 +7893,31 @@
     </w:pPr>
     <w:rPr/>
   </w:style>
-  <w:style w:type="paragraph" w:styleId="user5">
+  <w:style w:type="paragraph" w:styleId="Style21">
+    <w:name w:val="Содержимое врезки"/>
+    <w:basedOn w:val="Normal"/>
+    <w:qFormat/>
+    <w:pPr/>
+    <w:rPr/>
+  </w:style>
+  <w:style w:type="paragraph" w:styleId="Style22">
+    <w:name w:val="Содержимое таблицы"/>
+    <w:basedOn w:val="Normal"/>
+    <w:qFormat/>
+    <w:pPr>
+      <w:widowControl w:val="false"/>
+      <w:suppressLineNumbers/>
+    </w:pPr>
+    <w:rPr/>
+  </w:style>
+  <w:style w:type="paragraph" w:styleId="user4">
     <w:name w:val="Содержимое врезки (user)"/>
     <w:basedOn w:val="Normal"/>
     <w:qFormat/>
     <w:pPr/>
     <w:rPr/>
   </w:style>
-  <w:style w:type="paragraph" w:styleId="user6">
+  <w:style w:type="paragraph" w:styleId="user5">
     <w:name w:val="Содержимое таблицы (user)"/>
     <w:basedOn w:val="Normal"/>
     <w:qFormat/>
@@ -7793,25 +7927,8 @@
     </w:pPr>
     <w:rPr/>
   </w:style>
-  <w:style w:type="paragraph" w:styleId="Style20">
-    <w:name w:val="Содержимое врезки"/>
-    <w:basedOn w:val="Normal"/>
-    <w:qFormat/>
-    <w:pPr/>
-    <w:rPr/>
-  </w:style>
-  <w:style w:type="paragraph" w:styleId="Style21">
-    <w:name w:val="Содержимое таблицы"/>
-    <w:basedOn w:val="Normal"/>
-    <w:qFormat/>
-    <w:pPr>
-      <w:widowControl w:val="false"/>
-      <w:suppressLineNumbers/>
-    </w:pPr>
-    <w:rPr/>
-  </w:style>
-  <w:style w:type="numbering" w:styleId="user7" w:default="1">
-    <w:name w:val="Без списка (user)"/>
+  <w:style w:type="numbering" w:styleId="Style23" w:default="1">
+    <w:name w:val="Без списка"/>
     <w:uiPriority w:val="99"/>
     <w:semiHidden/>
     <w:unhideWhenUsed/>

</xml_diff>